<commit_message>
Creating a guide for the experiment
</commit_message>
<xml_diff>
--- a/Capstone/Documentation/Analisis.docx
+++ b/Capstone/Documentation/Analisis.docx
@@ -177,8 +177,13 @@
         <w:ind w:left="3476" w:right="3484"/>
         <w:jc w:val="center"/>
       </w:pPr>
-      <w:r>
-        <w:t xml:space="preserve">Andres </w:t>
+      <w:proofErr w:type="spellStart"/>
+      <w:r>
+        <w:t>Andres</w:t>
+      </w:r>
+      <w:proofErr w:type="spellEnd"/>
+      <w:r>
+        <w:t xml:space="preserve"> </w:t>
       </w:r>
       <w:r>
         <w:rPr>
@@ -217,17 +222,24 @@
         <w:ind w:left="3472" w:right="3497"/>
         <w:jc w:val="center"/>
       </w:pPr>
+      <w:proofErr w:type="spellStart"/>
       <w:r>
         <w:t>Josue</w:t>
       </w:r>
+      <w:proofErr w:type="spellEnd"/>
       <w:r>
         <w:rPr>
           <w:spacing w:val="-14"/>
         </w:rPr>
         <w:t xml:space="preserve"> </w:t>
       </w:r>
-      <w:r>
-        <w:t>Rodriguez A00359703</w:t>
+      <w:proofErr w:type="spellStart"/>
+      <w:r>
+        <w:t>Rodriguez</w:t>
+      </w:r>
+      <w:proofErr w:type="spellEnd"/>
+      <w:r>
+        <w:t xml:space="preserve"> A00359703</w:t>
       </w:r>
     </w:p>
     <w:p>
@@ -512,7 +524,130 @@
         <w:rPr>
           <w:sz w:val="24"/>
         </w:rPr>
-        <w:t xml:space="preserve"> dataset (Incluye tanto el de prueba como el de entrenamiento).</w:t>
+        <w:t xml:space="preserve"> dataset (Incluye tanto el de prueba</w:t>
+      </w:r>
+      <w:r>
+        <w:rPr>
+          <w:sz w:val="24"/>
+        </w:rPr>
+        <w:t xml:space="preserve">, </w:t>
+      </w:r>
+      <w:r>
+        <w:rPr>
+          <w:sz w:val="24"/>
+        </w:rPr>
+        <w:t>el de entrenamiento</w:t>
+      </w:r>
+      <w:r>
+        <w:rPr>
+          <w:sz w:val="24"/>
+        </w:rPr>
+        <w:t xml:space="preserve"> y el dataset completo</w:t>
+      </w:r>
+      <w:r>
+        <w:rPr>
+          <w:sz w:val="24"/>
+        </w:rPr>
+        <w:t>).</w:t>
+      </w:r>
+    </w:p>
+    <w:p>
+      <w:pPr>
+        <w:pStyle w:val="ListParagraph"/>
+        <w:numPr>
+          <w:ilvl w:val="0"/>
+          <w:numId w:val="1"/>
+        </w:numPr>
+        <w:tabs>
+          <w:tab w:val="left" w:pos="821"/>
+          <w:tab w:val="left" w:pos="822"/>
+        </w:tabs>
+        <w:spacing w:before="53"/>
+        <w:rPr>
+          <w:sz w:val="24"/>
+        </w:rPr>
+      </w:pPr>
+      <w:r>
+        <w:rPr>
+          <w:sz w:val="24"/>
+        </w:rPr>
+        <w:t>Tipo de algoritmo para realizar la clasificación (Manual o de librería).</w:t>
+      </w:r>
+    </w:p>
+    <w:p>
+      <w:pPr>
+        <w:pStyle w:val="BodyText"/>
+        <w:rPr>
+          <w:sz w:val="26"/>
+        </w:rPr>
+      </w:pPr>
+    </w:p>
+    <w:p>
+      <w:pPr>
+        <w:pStyle w:val="BodyText"/>
+        <w:spacing w:before="5"/>
+        <w:rPr>
+          <w:sz w:val="37"/>
+        </w:rPr>
+      </w:pPr>
+    </w:p>
+    <w:p>
+      <w:pPr>
+        <w:pStyle w:val="Heading1"/>
+        <w:ind w:left="2651" w:right="2656"/>
+      </w:pPr>
+      <w:r>
+        <w:t>Factores No-Controlables</w:t>
+      </w:r>
+    </w:p>
+    <w:p>
+      <w:pPr>
+        <w:pStyle w:val="BodyText"/>
+        <w:spacing w:before="4"/>
+        <w:rPr>
+          <w:b/>
+          <w:sz w:val="33"/>
+        </w:rPr>
+      </w:pPr>
+    </w:p>
+    <w:p>
+      <w:pPr>
+        <w:pStyle w:val="ListParagraph"/>
+        <w:numPr>
+          <w:ilvl w:val="0"/>
+          <w:numId w:val="1"/>
+        </w:numPr>
+        <w:tabs>
+          <w:tab w:val="left" w:pos="821"/>
+          <w:tab w:val="left" w:pos="822"/>
+        </w:tabs>
+        <w:rPr>
+          <w:sz w:val="24"/>
+        </w:rPr>
+      </w:pPr>
+      <w:r>
+        <w:rPr>
+          <w:sz w:val="24"/>
+        </w:rPr>
+        <w:t>El valor de los</w:t>
+      </w:r>
+      <w:r>
+        <w:rPr>
+          <w:sz w:val="24"/>
+        </w:rPr>
+        <w:t xml:space="preserve"> atributos</w:t>
+      </w:r>
+      <w:r>
+        <w:rPr>
+          <w:sz w:val="24"/>
+        </w:rPr>
+        <w:t xml:space="preserve"> que </w:t>
+      </w:r>
+      <w:r>
+        <w:rPr>
+          <w:sz w:val="24"/>
+        </w:rPr>
+        <w:t>serán clasificados por el árbol de decisión.</w:t>
       </w:r>
     </w:p>
     <w:p>
@@ -531,115 +666,17 @@
           <w:sz w:val="24"/>
         </w:rPr>
       </w:pPr>
-    </w:p>
-    <w:p>
-      <w:pPr>
-        <w:pStyle w:val="ListParagraph"/>
-        <w:numPr>
-          <w:ilvl w:val="0"/>
-          <w:numId w:val="1"/>
-        </w:numPr>
-        <w:tabs>
-          <w:tab w:val="left" w:pos="821"/>
-          <w:tab w:val="left" w:pos="822"/>
-        </w:tabs>
-        <w:spacing w:before="53"/>
+      <w:r>
         <w:rPr>
           <w:sz w:val="24"/>
         </w:rPr>
-      </w:pPr>
+        <w:t>Los recursos del ordenador donde se hacen las pruebas</w:t>
+      </w:r>
       <w:r>
         <w:rPr>
           <w:sz w:val="24"/>
         </w:rPr>
-        <w:t>Tipo de algoritmo para realizar la clasificación (Manual o de librería).</w:t>
-      </w:r>
-    </w:p>
-    <w:p>
-      <w:pPr>
-        <w:pStyle w:val="BodyText"/>
-        <w:rPr>
-          <w:sz w:val="26"/>
-        </w:rPr>
-      </w:pPr>
-    </w:p>
-    <w:p>
-      <w:pPr>
-        <w:pStyle w:val="BodyText"/>
-        <w:spacing w:before="5"/>
-        <w:rPr>
-          <w:sz w:val="37"/>
-        </w:rPr>
-      </w:pPr>
-    </w:p>
-    <w:p>
-      <w:pPr>
-        <w:pStyle w:val="Heading1"/>
-        <w:ind w:left="2651" w:right="2656"/>
-      </w:pPr>
-      <w:r>
-        <w:t>Factores No-Controlables</w:t>
-      </w:r>
-    </w:p>
-    <w:p>
-      <w:pPr>
-        <w:pStyle w:val="BodyText"/>
-        <w:spacing w:before="4"/>
-        <w:rPr>
-          <w:b/>
-          <w:sz w:val="33"/>
-        </w:rPr>
-      </w:pPr>
-    </w:p>
-    <w:p>
-      <w:pPr>
-        <w:pStyle w:val="ListParagraph"/>
-        <w:numPr>
-          <w:ilvl w:val="0"/>
-          <w:numId w:val="1"/>
-        </w:numPr>
-        <w:tabs>
-          <w:tab w:val="left" w:pos="821"/>
-          <w:tab w:val="left" w:pos="822"/>
-        </w:tabs>
-        <w:rPr>
-          <w:sz w:val="24"/>
-        </w:rPr>
-      </w:pPr>
-      <w:r>
-        <w:rPr>
-          <w:sz w:val="24"/>
-        </w:rPr>
-        <w:t>El valor de los atributos</w:t>
-      </w:r>
-      <w:r>
-        <w:rPr>
-          <w:sz w:val="24"/>
-        </w:rPr>
-        <w:t xml:space="preserve"> que serán clasificados por el árbol de decisión.</w:t>
-      </w:r>
-    </w:p>
-    <w:p>
-      <w:pPr>
-        <w:pStyle w:val="ListParagraph"/>
-        <w:numPr>
-          <w:ilvl w:val="0"/>
-          <w:numId w:val="1"/>
-        </w:numPr>
-        <w:tabs>
-          <w:tab w:val="left" w:pos="821"/>
-          <w:tab w:val="left" w:pos="822"/>
-        </w:tabs>
-        <w:spacing w:before="39"/>
-        <w:rPr>
-          <w:sz w:val="24"/>
-        </w:rPr>
-      </w:pPr>
-      <w:r>
-        <w:rPr>
-          <w:sz w:val="24"/>
-        </w:rPr>
-        <w:t>Los recursos del ordenador donde se hacen las pruebas.</w:t>
+        <w:t>.</w:t>
       </w:r>
     </w:p>
     <w:p>
@@ -662,7 +699,13 @@
         <w:rPr>
           <w:sz w:val="24"/>
         </w:rPr>
-        <w:t>La temperatura del ordenador.</w:t>
+        <w:t>La temperatura</w:t>
+      </w:r>
+      <w:r>
+        <w:rPr>
+          <w:sz w:val="24"/>
+        </w:rPr>
+        <w:t xml:space="preserve"> del ordenador.</w:t>
       </w:r>
     </w:p>
     <w:p>
@@ -685,7 +728,13 @@
         <w:rPr>
           <w:sz w:val="24"/>
         </w:rPr>
-        <w:t>Recursos asignados o libres para ejecutar el algoritmo.</w:t>
+        <w:t>Recursos asignados o libres para ejecutar el algoritmo</w:t>
+      </w:r>
+      <w:r>
+        <w:rPr>
+          <w:sz w:val="24"/>
+        </w:rPr>
+        <w:t>.</w:t>
       </w:r>
     </w:p>
     <w:p>
@@ -911,7 +960,7 @@
               <w:rPr>
                 <w:sz w:val="24"/>
               </w:rPr>
-              <w:t>Cantidad de Datos</w:t>
+              <w:t>Tipo de dataset</w:t>
             </w:r>
           </w:p>
         </w:tc>
@@ -932,72 +981,7 @@
               <w:rPr>
                 <w:sz w:val="24"/>
               </w:rPr>
-              <w:t>10</w:t>
-            </w:r>
-            <w:r>
-              <w:rPr>
-                <w:sz w:val="24"/>
-                <w:vertAlign w:val="superscript"/>
-              </w:rPr>
-              <w:t>1</w:t>
-            </w:r>
-            <w:r>
-              <w:rPr>
-                <w:sz w:val="24"/>
-              </w:rPr>
-              <w:t xml:space="preserve"> , 10</w:t>
-            </w:r>
-            <w:r>
-              <w:rPr>
-                <w:sz w:val="24"/>
-                <w:vertAlign w:val="superscript"/>
-              </w:rPr>
-              <w:t>2</w:t>
-            </w:r>
-            <w:r>
-              <w:rPr>
-                <w:sz w:val="24"/>
-              </w:rPr>
-              <w:t xml:space="preserve"> , 10</w:t>
-            </w:r>
-            <w:r>
-              <w:rPr>
-                <w:sz w:val="24"/>
-                <w:vertAlign w:val="superscript"/>
-              </w:rPr>
-              <w:t>3</w:t>
-            </w:r>
-            <w:r>
-              <w:rPr>
-                <w:sz w:val="24"/>
-              </w:rPr>
-              <w:t xml:space="preserve"> , 10</w:t>
-            </w:r>
-            <w:r>
-              <w:rPr>
-                <w:sz w:val="24"/>
-                <w:vertAlign w:val="superscript"/>
-              </w:rPr>
-              <w:t>4</w:t>
-            </w:r>
-            <w:r>
-              <w:rPr>
-                <w:sz w:val="24"/>
-              </w:rPr>
-              <w:t xml:space="preserve"> , 10</w:t>
-            </w:r>
-            <w:r>
-              <w:rPr>
-                <w:sz w:val="24"/>
-                <w:vertAlign w:val="superscript"/>
-              </w:rPr>
-              <w:t>5</w:t>
-            </w:r>
-            <w:r>
-              <w:rPr>
-                <w:sz w:val="24"/>
-              </w:rPr>
-              <w:t xml:space="preserve"> ,</w:t>
+              <w:t>Training, Probe, Complete</w:t>
             </w:r>
           </w:p>
         </w:tc>
@@ -1022,7 +1006,7 @@
               <w:rPr>
                 <w:sz w:val="24"/>
               </w:rPr>
-              <w:t>Estado de la estructura de Datos</w:t>
+              <w:t>Tipo de implementación de ID3</w:t>
             </w:r>
           </w:p>
         </w:tc>
@@ -1033,8 +1017,8 @@
           <w:p>
             <w:pPr>
               <w:pStyle w:val="TableParagraph"/>
-              <w:spacing w:line="273" w:lineRule="exact"/>
-              <w:ind w:left="171"/>
+              <w:spacing w:before="2" w:line="235" w:lineRule="auto"/>
+              <w:ind w:left="173"/>
               <w:rPr>
                 <w:sz w:val="24"/>
               </w:rPr>
@@ -1043,68 +1027,487 @@
               <w:rPr>
                 <w:sz w:val="24"/>
               </w:rPr>
-              <w:t>Ordenado</w:t>
+              <w:t>Manual o Library</w:t>
             </w:r>
           </w:p>
+        </w:tc>
+      </w:tr>
+    </w:tbl>
+    <w:p>
+      <w:pPr>
+        <w:rPr>
+          <w:sz w:val="24"/>
+        </w:rPr>
+        <w:sectPr>
+          <w:pgSz w:w="11920" w:h="16860"/>
+          <w:pgMar w:top="1380" w:right="1340" w:bottom="280" w:left="1340" w:header="720" w:footer="720" w:gutter="0"/>
+          <w:cols w:space="720"/>
+        </w:sectPr>
+      </w:pPr>
+    </w:p>
+    <w:p>
+      <w:pPr>
+        <w:spacing w:before="62"/>
+        <w:ind w:left="3476" w:right="3497"/>
+        <w:jc w:val="center"/>
+        <w:rPr>
+          <w:b/>
+          <w:sz w:val="24"/>
+        </w:rPr>
+      </w:pPr>
+      <w:r>
+        <w:rPr>
+          <w:b/>
+          <w:sz w:val="24"/>
+        </w:rPr>
+        <w:lastRenderedPageBreak/>
+        <w:t>Tratamientos</w:t>
+      </w:r>
+    </w:p>
+    <w:p>
+      <w:pPr>
+        <w:pStyle w:val="BodyText"/>
+        <w:rPr>
+          <w:b/>
+          <w:sz w:val="20"/>
+        </w:rPr>
+      </w:pPr>
+    </w:p>
+    <w:p>
+      <w:pPr>
+        <w:pStyle w:val="BodyText"/>
+        <w:rPr>
+          <w:b/>
+          <w:sz w:val="20"/>
+        </w:rPr>
+      </w:pPr>
+    </w:p>
+    <w:tbl>
+      <w:tblPr>
+        <w:tblStyle w:val="TableGrid"/>
+        <w:tblW w:w="0" w:type="auto"/>
+        <w:tblLook w:val="04A0" w:firstRow="1" w:lastRow="0" w:firstColumn="1" w:lastColumn="0" w:noHBand="0" w:noVBand="1"/>
+      </w:tblPr>
+      <w:tblGrid>
+        <w:gridCol w:w="3076"/>
+        <w:gridCol w:w="3077"/>
+        <w:gridCol w:w="3077"/>
+      </w:tblGrid>
+      <w:tr>
+        <w:tc>
+          <w:tcPr>
+            <w:tcW w:w="3076" w:type="dxa"/>
+          </w:tcPr>
           <w:p>
             <w:pPr>
-              <w:pStyle w:val="TableParagraph"/>
-              <w:spacing w:before="2" w:line="235" w:lineRule="auto"/>
-              <w:ind w:left="173"/>
-              <w:rPr>
-                <w:sz w:val="24"/>
+              <w:pStyle w:val="BodyText"/>
+              <w:spacing w:before="9"/>
+              <w:jc w:val="center"/>
+              <w:rPr>
+                <w:b/>
               </w:rPr>
             </w:pPr>
             <w:r>
               <w:rPr>
-                <w:sz w:val="24"/>
-              </w:rPr>
-              <w:t>Descendente,Desordenado,Ordenado ascendente</w:t>
+                <w:b/>
+              </w:rPr>
+              <w:t>Numero de Tratamiento</w:t>
+            </w:r>
+          </w:p>
+        </w:tc>
+        <w:tc>
+          <w:tcPr>
+            <w:tcW w:w="3077" w:type="dxa"/>
+          </w:tcPr>
+          <w:p>
+            <w:pPr>
+              <w:pStyle w:val="BodyText"/>
+              <w:spacing w:before="9"/>
+              <w:jc w:val="center"/>
+              <w:rPr>
+                <w:b/>
+              </w:rPr>
+            </w:pPr>
+            <w:r>
+              <w:rPr>
+                <w:b/>
+              </w:rPr>
+              <w:t>Tipo de Dataset</w:t>
+            </w:r>
+          </w:p>
+        </w:tc>
+        <w:tc>
+          <w:tcPr>
+            <w:tcW w:w="3077" w:type="dxa"/>
+          </w:tcPr>
+          <w:p>
+            <w:pPr>
+              <w:pStyle w:val="BodyText"/>
+              <w:spacing w:before="9"/>
+              <w:jc w:val="center"/>
+              <w:rPr>
+                <w:b/>
+              </w:rPr>
+            </w:pPr>
+            <w:r>
+              <w:rPr>
+                <w:b/>
+              </w:rPr>
+              <w:t>Tipo de Algoritmo</w:t>
             </w:r>
           </w:p>
         </w:tc>
       </w:tr>
       <w:tr>
-        <w:trPr>
-          <w:trHeight w:val="475"/>
-        </w:trPr>
         <w:tc>
           <w:tcPr>
-            <w:tcW w:w="4504" w:type="dxa"/>
+            <w:tcW w:w="3076" w:type="dxa"/>
           </w:tcPr>
           <w:p>
             <w:pPr>
-              <w:pStyle w:val="TableParagraph"/>
-              <w:spacing w:before="88"/>
-              <w:rPr>
-                <w:sz w:val="24"/>
+              <w:pStyle w:val="BodyText"/>
+              <w:spacing w:before="9"/>
+              <w:jc w:val="center"/>
+              <w:rPr>
+                <w:bCs/>
               </w:rPr>
             </w:pPr>
             <w:r>
               <w:rPr>
-                <w:sz w:val="24"/>
-              </w:rPr>
-              <w:t>Estado del Algoritmo</w:t>
+                <w:bCs/>
+              </w:rPr>
+              <w:t>1</w:t>
             </w:r>
           </w:p>
         </w:tc>
         <w:tc>
           <w:tcPr>
-            <w:tcW w:w="4504" w:type="dxa"/>
+            <w:tcW w:w="3077" w:type="dxa"/>
           </w:tcPr>
           <w:p>
             <w:pPr>
-              <w:pStyle w:val="TableParagraph"/>
-              <w:spacing w:before="88"/>
-              <w:rPr>
-                <w:sz w:val="24"/>
+              <w:pStyle w:val="BodyText"/>
+              <w:spacing w:before="9"/>
+              <w:jc w:val="center"/>
+              <w:rPr>
+                <w:b/>
               </w:rPr>
             </w:pPr>
             <w:r>
-              <w:rPr>
-                <w:sz w:val="24"/>
-              </w:rPr>
-              <w:t>QS normal, QS aleatorizado(Randomized)</w:t>
+              <w:t>Training</w:t>
+            </w:r>
+          </w:p>
+        </w:tc>
+        <w:tc>
+          <w:tcPr>
+            <w:tcW w:w="3077" w:type="dxa"/>
+          </w:tcPr>
+          <w:p>
+            <w:pPr>
+              <w:pStyle w:val="BodyText"/>
+              <w:spacing w:before="9"/>
+              <w:jc w:val="center"/>
+              <w:rPr>
+                <w:b/>
+              </w:rPr>
+            </w:pPr>
+            <w:r>
+              <w:t>Manual</w:t>
+            </w:r>
+          </w:p>
+        </w:tc>
+      </w:tr>
+      <w:tr>
+        <w:tc>
+          <w:tcPr>
+            <w:tcW w:w="3076" w:type="dxa"/>
+          </w:tcPr>
+          <w:p>
+            <w:pPr>
+              <w:pStyle w:val="BodyText"/>
+              <w:spacing w:before="9"/>
+              <w:jc w:val="center"/>
+              <w:rPr>
+                <w:bCs/>
+              </w:rPr>
+            </w:pPr>
+            <w:r>
+              <w:rPr>
+                <w:bCs/>
+              </w:rPr>
+              <w:t>2</w:t>
+            </w:r>
+          </w:p>
+        </w:tc>
+        <w:tc>
+          <w:tcPr>
+            <w:tcW w:w="3077" w:type="dxa"/>
+          </w:tcPr>
+          <w:p>
+            <w:pPr>
+              <w:pStyle w:val="BodyText"/>
+              <w:spacing w:before="9"/>
+              <w:jc w:val="center"/>
+              <w:rPr>
+                <w:b/>
+              </w:rPr>
+            </w:pPr>
+            <w:r>
+              <w:t>Training</w:t>
+            </w:r>
+          </w:p>
+        </w:tc>
+        <w:tc>
+          <w:tcPr>
+            <w:tcW w:w="3077" w:type="dxa"/>
+          </w:tcPr>
+          <w:p>
+            <w:pPr>
+              <w:pStyle w:val="BodyText"/>
+              <w:spacing w:before="9"/>
+              <w:jc w:val="center"/>
+              <w:rPr>
+                <w:b/>
+              </w:rPr>
+            </w:pPr>
+            <w:r>
+              <w:t>Library</w:t>
+            </w:r>
+          </w:p>
+        </w:tc>
+      </w:tr>
+      <w:tr>
+        <w:tc>
+          <w:tcPr>
+            <w:tcW w:w="3076" w:type="dxa"/>
+          </w:tcPr>
+          <w:p>
+            <w:pPr>
+              <w:pStyle w:val="BodyText"/>
+              <w:spacing w:before="9"/>
+              <w:jc w:val="center"/>
+              <w:rPr>
+                <w:bCs/>
+              </w:rPr>
+            </w:pPr>
+            <w:r>
+              <w:rPr>
+                <w:bCs/>
+              </w:rPr>
+              <w:t>3</w:t>
+            </w:r>
+          </w:p>
+        </w:tc>
+        <w:tc>
+          <w:tcPr>
+            <w:tcW w:w="3077" w:type="dxa"/>
+          </w:tcPr>
+          <w:p>
+            <w:pPr>
+              <w:pStyle w:val="BodyText"/>
+              <w:spacing w:before="9"/>
+              <w:jc w:val="center"/>
+              <w:rPr>
+                <w:b/>
+              </w:rPr>
+            </w:pPr>
+            <w:r>
+              <w:t>Probe</w:t>
+            </w:r>
+          </w:p>
+        </w:tc>
+        <w:tc>
+          <w:tcPr>
+            <w:tcW w:w="3077" w:type="dxa"/>
+          </w:tcPr>
+          <w:p>
+            <w:pPr>
+              <w:pStyle w:val="BodyText"/>
+              <w:spacing w:before="9"/>
+              <w:jc w:val="center"/>
+              <w:rPr>
+                <w:b/>
+              </w:rPr>
+            </w:pPr>
+            <w:r>
+              <w:t>Manual</w:t>
+            </w:r>
+          </w:p>
+        </w:tc>
+      </w:tr>
+      <w:tr>
+        <w:tc>
+          <w:tcPr>
+            <w:tcW w:w="3076" w:type="dxa"/>
+          </w:tcPr>
+          <w:p>
+            <w:pPr>
+              <w:pStyle w:val="BodyText"/>
+              <w:spacing w:before="9"/>
+              <w:jc w:val="center"/>
+              <w:rPr>
+                <w:bCs/>
+              </w:rPr>
+            </w:pPr>
+            <w:r>
+              <w:rPr>
+                <w:bCs/>
+              </w:rPr>
+              <w:t>4</w:t>
+            </w:r>
+          </w:p>
+        </w:tc>
+        <w:tc>
+          <w:tcPr>
+            <w:tcW w:w="3077" w:type="dxa"/>
+          </w:tcPr>
+          <w:p>
+            <w:pPr>
+              <w:pStyle w:val="BodyText"/>
+              <w:spacing w:before="9"/>
+              <w:jc w:val="center"/>
+              <w:rPr>
+                <w:b/>
+              </w:rPr>
+            </w:pPr>
+            <w:r>
+              <w:t>Probe</w:t>
+            </w:r>
+          </w:p>
+        </w:tc>
+        <w:tc>
+          <w:tcPr>
+            <w:tcW w:w="3077" w:type="dxa"/>
+          </w:tcPr>
+          <w:p>
+            <w:pPr>
+              <w:pStyle w:val="BodyText"/>
+              <w:spacing w:before="9"/>
+              <w:jc w:val="center"/>
+              <w:rPr>
+                <w:b/>
+              </w:rPr>
+            </w:pPr>
+            <w:r>
+              <w:t>Library</w:t>
+            </w:r>
+          </w:p>
+        </w:tc>
+      </w:tr>
+      <w:tr>
+        <w:tc>
+          <w:tcPr>
+            <w:tcW w:w="3076" w:type="dxa"/>
+          </w:tcPr>
+          <w:p>
+            <w:pPr>
+              <w:pStyle w:val="BodyText"/>
+              <w:spacing w:before="9"/>
+              <w:jc w:val="center"/>
+              <w:rPr>
+                <w:bCs/>
+              </w:rPr>
+            </w:pPr>
+            <w:r>
+              <w:rPr>
+                <w:bCs/>
+              </w:rPr>
+              <w:t>5</w:t>
+            </w:r>
+          </w:p>
+        </w:tc>
+        <w:tc>
+          <w:tcPr>
+            <w:tcW w:w="3077" w:type="dxa"/>
+          </w:tcPr>
+          <w:p>
+            <w:pPr>
+              <w:pStyle w:val="BodyText"/>
+              <w:spacing w:before="9"/>
+              <w:jc w:val="center"/>
+              <w:rPr>
+                <w:b/>
+              </w:rPr>
+            </w:pPr>
+            <w:r>
+              <w:t>Complete</w:t>
+            </w:r>
+          </w:p>
+        </w:tc>
+        <w:tc>
+          <w:tcPr>
+            <w:tcW w:w="3077" w:type="dxa"/>
+          </w:tcPr>
+          <w:p>
+            <w:pPr>
+              <w:pStyle w:val="BodyText"/>
+              <w:spacing w:before="9"/>
+              <w:jc w:val="center"/>
+              <w:rPr>
+                <w:b/>
+              </w:rPr>
+            </w:pPr>
+            <w:r>
+              <w:t>Manual</w:t>
+            </w:r>
+          </w:p>
+        </w:tc>
+      </w:tr>
+      <w:tr>
+        <w:tc>
+          <w:tcPr>
+            <w:tcW w:w="3076" w:type="dxa"/>
+          </w:tcPr>
+          <w:p>
+            <w:pPr>
+              <w:pStyle w:val="BodyText"/>
+              <w:spacing w:before="9"/>
+              <w:jc w:val="center"/>
+              <w:rPr>
+                <w:bCs/>
+              </w:rPr>
+            </w:pPr>
+            <w:r>
+              <w:rPr>
+                <w:bCs/>
+              </w:rPr>
+              <w:t>6</w:t>
+            </w:r>
+          </w:p>
+        </w:tc>
+        <w:tc>
+          <w:tcPr>
+            <w:tcW w:w="3077" w:type="dxa"/>
+          </w:tcPr>
+          <w:p>
+            <w:pPr>
+              <w:pStyle w:val="BodyText"/>
+              <w:spacing w:before="9"/>
+              <w:jc w:val="center"/>
+              <w:rPr>
+                <w:b/>
+              </w:rPr>
+            </w:pPr>
+            <w:r>
+              <w:t>Complete</w:t>
+            </w:r>
+          </w:p>
+        </w:tc>
+        <w:tc>
+          <w:tcPr>
+            <w:tcW w:w="3077" w:type="dxa"/>
+          </w:tcPr>
+          <w:p>
+            <w:pPr>
+              <w:pStyle w:val="BodyText"/>
+              <w:spacing w:before="9"/>
+              <w:jc w:val="center"/>
+              <w:rPr>
+                <w:b/>
+              </w:rPr>
+            </w:pPr>
+            <w:r>
+              <w:t>Library</w:t>
             </w:r>
           </w:p>
         </w:tc>
@@ -1112,117 +1515,20 @@
     </w:tbl>
     <w:p>
       <w:pPr>
-        <w:rPr>
-          <w:sz w:val="24"/>
-        </w:rPr>
-        <w:sectPr>
-          <w:pgSz w:w="11920" w:h="16860"/>
-          <w:pgMar w:top="1380" w:right="1340" w:bottom="280" w:left="1340" w:header="720" w:footer="720" w:gutter="0"/>
-          <w:cols w:space="720"/>
-        </w:sectPr>
-      </w:pPr>
-    </w:p>
-    <w:p>
-      <w:pPr>
-        <w:spacing w:before="62"/>
-        <w:ind w:left="3476" w:right="3497"/>
+        <w:pStyle w:val="BodyText"/>
+        <w:spacing w:before="9"/>
         <w:jc w:val="center"/>
         <w:rPr>
           <w:b/>
-          <w:sz w:val="24"/>
-        </w:rPr>
-      </w:pPr>
-      <w:r>
+        </w:rPr>
+      </w:pPr>
+    </w:p>
+    <w:p>
+      <w:pPr>
+        <w:pStyle w:val="BodyText"/>
+        <w:jc w:val="center"/>
         <w:rPr>
           <w:b/>
-          <w:sz w:val="24"/>
-        </w:rPr>
-        <w:lastRenderedPageBreak/>
-        <w:t>Tratamientos</w:t>
-      </w:r>
-    </w:p>
-    <w:p>
-      <w:pPr>
-        <w:pStyle w:val="BodyText"/>
-        <w:rPr>
-          <w:b/>
-          <w:sz w:val="20"/>
-        </w:rPr>
-      </w:pPr>
-    </w:p>
-    <w:p>
-      <w:pPr>
-        <w:pStyle w:val="BodyText"/>
-        <w:rPr>
-          <w:b/>
-          <w:sz w:val="20"/>
-        </w:rPr>
-      </w:pPr>
-    </w:p>
-    <w:p>
-      <w:pPr>
-        <w:pStyle w:val="BodyText"/>
-        <w:spacing w:before="9"/>
-        <w:rPr>
-          <w:b/>
-          <w:sz w:val="14"/>
-        </w:rPr>
-      </w:pPr>
-      <w:r>
-        <w:rPr>
-          <w:noProof/>
-        </w:rPr>
-        <w:drawing>
-          <wp:anchor distT="0" distB="0" distL="0" distR="0" simplePos="0" relativeHeight="251657216" behindDoc="0" locked="0" layoutInCell="1" allowOverlap="1" wp14:anchorId="6A362305" wp14:editId="39EA743F">
-            <wp:simplePos x="0" y="0"/>
-            <wp:positionH relativeFrom="page">
-              <wp:posOffset>2163990</wp:posOffset>
-            </wp:positionH>
-            <wp:positionV relativeFrom="paragraph">
-              <wp:posOffset>132757</wp:posOffset>
-            </wp:positionV>
-            <wp:extent cx="3219451" cy="6562725"/>
-            <wp:effectExtent l="0" t="0" r="0" b="0"/>
-            <wp:wrapTopAndBottom/>
-            <wp:docPr id="1" name="image1.png"/>
-            <wp:cNvGraphicFramePr>
-              <a:graphicFrameLocks xmlns:a="http://schemas.openxmlformats.org/drawingml/2006/main" noChangeAspect="1"/>
-            </wp:cNvGraphicFramePr>
-            <a:graphic xmlns:a="http://schemas.openxmlformats.org/drawingml/2006/main">
-              <a:graphicData uri="http://schemas.openxmlformats.org/drawingml/2006/picture">
-                <pic:pic xmlns:pic="http://schemas.openxmlformats.org/drawingml/2006/picture">
-                  <pic:nvPicPr>
-                    <pic:cNvPr id="2" name="image1.png"/>
-                    <pic:cNvPicPr/>
-                  </pic:nvPicPr>
-                  <pic:blipFill>
-                    <a:blip r:embed="rId5" cstate="print"/>
-                    <a:stretch>
-                      <a:fillRect/>
-                    </a:stretch>
-                  </pic:blipFill>
-                  <pic:spPr>
-                    <a:xfrm>
-                      <a:off x="0" y="0"/>
-                      <a:ext cx="3219451" cy="6562725"/>
-                    </a:xfrm>
-                    <a:prstGeom prst="rect">
-                      <a:avLst/>
-                    </a:prstGeom>
-                  </pic:spPr>
-                </pic:pic>
-              </a:graphicData>
-            </a:graphic>
-          </wp:anchor>
-        </w:drawing>
-      </w:r>
-    </w:p>
-    <w:p>
-      <w:pPr>
-        <w:pStyle w:val="BodyText"/>
-        <w:rPr>
-          <w:b/>
-          <w:sz w:val="20"/>
         </w:rPr>
       </w:pPr>
     </w:p>
@@ -1235,157 +1541,6 @@
           <w:sz w:val="29"/>
         </w:rPr>
       </w:pPr>
-    </w:p>
-    <w:p>
-      <w:pPr>
-        <w:spacing w:before="95" w:line="235" w:lineRule="auto"/>
-        <w:ind w:left="101"/>
-        <w:rPr>
-          <w:b/>
-          <w:sz w:val="24"/>
-        </w:rPr>
-      </w:pPr>
-      <w:r>
-        <w:rPr>
-          <w:b/>
-          <w:sz w:val="24"/>
-        </w:rPr>
-        <w:t>¿Qué etapas del análisis y diseño de experimentos se han llevado a cabo hasta el momento?</w:t>
-      </w:r>
-    </w:p>
-    <w:p>
-      <w:pPr>
-        <w:spacing w:before="130" w:line="273" w:lineRule="auto"/>
-        <w:ind w:left="101"/>
-        <w:rPr>
-          <w:b/>
-          <w:sz w:val="24"/>
-        </w:rPr>
-      </w:pPr>
-      <w:r>
-        <w:rPr>
-          <w:sz w:val="24"/>
-        </w:rPr>
-        <w:t xml:space="preserve">De acuerdo al libro presentado en clase por el profesor, las partes que hemos realizado hasta ahora son </w:t>
-      </w:r>
-      <w:r>
-        <w:rPr>
-          <w:b/>
-          <w:sz w:val="24"/>
-        </w:rPr>
-        <w:t xml:space="preserve">Planeación y Realización del experimento </w:t>
-      </w:r>
-      <w:r>
-        <w:rPr>
-          <w:sz w:val="24"/>
-        </w:rPr>
-        <w:t xml:space="preserve">y </w:t>
-      </w:r>
-      <w:r>
-        <w:rPr>
-          <w:b/>
-          <w:sz w:val="24"/>
-        </w:rPr>
-        <w:t>Análisis</w:t>
-      </w:r>
-    </w:p>
-    <w:p>
-      <w:pPr>
-        <w:spacing w:line="273" w:lineRule="auto"/>
-        <w:rPr>
-          <w:sz w:val="24"/>
-        </w:rPr>
-        <w:sectPr>
-          <w:pgSz w:w="11920" w:h="16860"/>
-          <w:pgMar w:top="1380" w:right="1340" w:bottom="280" w:left="1340" w:header="720" w:footer="720" w:gutter="0"/>
-          <w:cols w:space="720"/>
-        </w:sectPr>
-      </w:pPr>
-    </w:p>
-    <w:p>
-      <w:pPr>
-        <w:pStyle w:val="Heading1"/>
-        <w:spacing w:before="67"/>
-        <w:ind w:right="0"/>
-        <w:jc w:val="left"/>
-      </w:pPr>
-      <w:r>
-        <w:lastRenderedPageBreak/>
-        <w:t>¿Cuáles hacen falta?</w:t>
-      </w:r>
-    </w:p>
-    <w:p>
-      <w:pPr>
-        <w:pStyle w:val="BodyText"/>
-        <w:spacing w:before="129"/>
-        <w:ind w:left="101"/>
-        <w:rPr>
-          <w:sz w:val="14"/>
-        </w:rPr>
-      </w:pPr>
-      <w:r>
-        <w:t>Hace falta la interpretación, controles y conclusiones finales</w:t>
-      </w:r>
-      <w:r>
-        <w:rPr>
-          <w:position w:val="9"/>
-          <w:sz w:val="14"/>
-        </w:rPr>
-        <w:t>1</w:t>
-      </w:r>
-    </w:p>
-    <w:p>
-      <w:pPr>
-        <w:pStyle w:val="BodyText"/>
-        <w:spacing w:before="10"/>
-        <w:rPr>
-          <w:sz w:val="30"/>
-        </w:rPr>
-      </w:pPr>
-    </w:p>
-    <w:p>
-      <w:pPr>
-        <w:pStyle w:val="Heading1"/>
-        <w:spacing w:line="247" w:lineRule="auto"/>
-        <w:ind w:right="109"/>
-        <w:jc w:val="both"/>
-      </w:pPr>
-      <w:r>
-        <w:t>El objetivo del anterior experimento en cual categoría de objetivos de experimentos clasificaría? Explique brevemente.</w:t>
-      </w:r>
-    </w:p>
-    <w:p>
-      <w:pPr>
-        <w:pStyle w:val="BodyText"/>
-        <w:spacing w:before="107"/>
-        <w:ind w:left="101"/>
-      </w:pPr>
-      <w:r>
-        <w:t>Diseño para comparar 2 o más tratamientos</w:t>
-      </w:r>
-    </w:p>
-    <w:p>
-      <w:pPr>
-        <w:pStyle w:val="BodyText"/>
-        <w:spacing w:before="9"/>
-        <w:rPr>
-          <w:sz w:val="30"/>
-        </w:rPr>
-      </w:pPr>
-    </w:p>
-    <w:p>
-      <w:pPr>
-        <w:pStyle w:val="BodyText"/>
-        <w:spacing w:before="1" w:line="273" w:lineRule="auto"/>
-        <w:ind w:left="101" w:right="105"/>
-        <w:jc w:val="both"/>
-      </w:pPr>
-      <w:r>
-        <w:t>Estamos comparando 2 algoritmos de diferente construcción y sus resultados en función del tiem</w:t>
-      </w:r>
-      <w:r>
-        <w:t>po con ello queremos determinar qué algoritmo es mejor (más eficiente en el tiempo) usando el tiempo promedio de salida como variable a contrastar.</w:t>
-      </w:r>
     </w:p>
     <w:p>
       <w:pPr>
@@ -1808,7 +1963,7 @@
           </mc:Choice>
           <mc:Fallback>
             <w:pict>
-              <v:line w14:anchorId="4F6EE87F" id="Line 2" o:spid="_x0000_s1026" style="position:absolute;z-index:-251658240;visibility:visible;mso-wrap-style:square;mso-width-percent:0;mso-height-percent:0;mso-wrap-distance-left:0;mso-wrap-distance-top:0;mso-wrap-distance-right:0;mso-wrap-distance-bottom:0;mso-position-horizontal:absolute;mso-position-horizontal-relative:page;mso-position-vertical:absolute;mso-position-vertical-relative:text;mso-width-percent:0;mso-height-percent:0;mso-width-relative:page;mso-height-relative:page" from="72.05pt,12.65pt" to="216.2pt,12.65pt" o:gfxdata="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" strokeweight=".26481mm">
+              <v:line w14:anchorId="4B82B959" id="Line 2" o:spid="_x0000_s1026" style="position:absolute;z-index:-251658240;visibility:visible;mso-wrap-style:square;mso-width-percent:0;mso-height-percent:0;mso-wrap-distance-left:0;mso-wrap-distance-top:0;mso-wrap-distance-right:0;mso-wrap-distance-bottom:0;mso-position-horizontal:absolute;mso-position-horizontal-relative:page;mso-position-vertical:absolute;mso-position-vertical-relative:text;mso-width-percent:0;mso-height-percent:0;mso-width-relative:page;mso-height-relative:page" from="72.05pt,12.65pt" to="216.2pt,12.65pt" o:gfxdata="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" strokeweight=".26481mm">
                 <w10:wrap type="topAndBottom" anchorx="page"/>
               </v:line>
             </w:pict>
@@ -1846,7 +2001,7 @@
         </w:rPr>
         <w:t>h</w:t>
       </w:r>
-      <w:hyperlink r:id="rId6">
+      <w:hyperlink r:id="rId5">
         <w:r>
           <w:rPr>
             <w:color w:val="1154CC"/>
@@ -1875,7 +2030,21 @@
         <w:rPr>
           <w:sz w:val="20"/>
         </w:rPr>
-        <w:t>en la pagina 10</w:t>
+        <w:t xml:space="preserve">en la </w:t>
+      </w:r>
+      <w:proofErr w:type="spellStart"/>
+      <w:r>
+        <w:rPr>
+          <w:sz w:val="20"/>
+        </w:rPr>
+        <w:t>pagina</w:t>
+      </w:r>
+      <w:proofErr w:type="spellEnd"/>
+      <w:r>
+        <w:rPr>
+          <w:sz w:val="20"/>
+        </w:rPr>
+        <w:t xml:space="preserve"> 10</w:t>
       </w:r>
     </w:p>
     <w:sectPr>
@@ -2490,6 +2659,22 @@
       <w:jc w:val="center"/>
     </w:pPr>
   </w:style>
+  <w:style w:type="table" w:styleId="TableGrid">
+    <w:name w:val="Table Grid"/>
+    <w:basedOn w:val="TableNormal"/>
+    <w:uiPriority w:val="39"/>
+    <w:rsid w:val="00DA7E49"/>
+    <w:tblPr>
+      <w:tblBorders>
+        <w:top w:val="single" w:sz="4" w:space="0" w:color="auto"/>
+        <w:left w:val="single" w:sz="4" w:space="0" w:color="auto"/>
+        <w:bottom w:val="single" w:sz="4" w:space="0" w:color="auto"/>
+        <w:right w:val="single" w:sz="4" w:space="0" w:color="auto"/>
+        <w:insideH w:val="single" w:sz="4" w:space="0" w:color="auto"/>
+        <w:insideV w:val="single" w:sz="4" w:space="0" w:color="auto"/>
+      </w:tblBorders>
+    </w:tblPr>
+  </w:style>
 </w:styles>
 </file>
 

</xml_diff>

<commit_message>
Ready but not in the principal documentation
</commit_message>
<xml_diff>
--- a/Capstone/Documentation/Analisis.docx
+++ b/Capstone/Documentation/Analisis.docx
@@ -177,11 +177,9 @@
         <w:ind w:left="3476" w:right="3484"/>
         <w:jc w:val="center"/>
       </w:pPr>
-      <w:proofErr w:type="spellStart"/>
-      <w:r>
-        <w:t>Andres</w:t>
-      </w:r>
-      <w:proofErr w:type="spellEnd"/>
+      <w:r>
+        <w:t>Andrés</w:t>
+      </w:r>
       <w:r>
         <w:t xml:space="preserve"> </w:t>
       </w:r>
@@ -222,22 +220,18 @@
         <w:ind w:left="3472" w:right="3497"/>
         <w:jc w:val="center"/>
       </w:pPr>
-      <w:proofErr w:type="spellStart"/>
-      <w:r>
-        <w:t>Josue</w:t>
-      </w:r>
-      <w:proofErr w:type="spellEnd"/>
+      <w:r>
+        <w:t>Josué</w:t>
+      </w:r>
       <w:r>
         <w:rPr>
           <w:spacing w:val="-14"/>
         </w:rPr>
         <w:t xml:space="preserve"> </w:t>
       </w:r>
-      <w:proofErr w:type="spellStart"/>
-      <w:r>
-        <w:t>Rodriguez</w:t>
-      </w:r>
-      <w:proofErr w:type="spellEnd"/>
+      <w:r>
+        <w:t>Rodríguez</w:t>
+      </w:r>
       <w:r>
         <w:t xml:space="preserve"> A00359703</w:t>
       </w:r>
@@ -807,48 +801,22 @@
     </w:p>
     <w:p>
       <w:pPr>
+        <w:pStyle w:val="BodyText"/>
+        <w:spacing w:before="9"/>
+        <w:rPr>
+          <w:b/>
+          <w:sz w:val="34"/>
+        </w:rPr>
+      </w:pPr>
+    </w:p>
+    <w:p>
+      <w:pPr>
         <w:pStyle w:val="Heading1"/>
         <w:ind w:left="3476" w:right="3490"/>
       </w:pPr>
       <w:r>
         <w:t>Niveles</w:t>
       </w:r>
-    </w:p>
-    <w:p>
-      <w:pPr>
-        <w:pStyle w:val="BodyText"/>
-        <w:rPr>
-          <w:b/>
-          <w:sz w:val="20"/>
-        </w:rPr>
-      </w:pPr>
-    </w:p>
-    <w:p>
-      <w:pPr>
-        <w:pStyle w:val="BodyText"/>
-        <w:rPr>
-          <w:b/>
-          <w:sz w:val="20"/>
-        </w:rPr>
-      </w:pPr>
-    </w:p>
-    <w:p>
-      <w:pPr>
-        <w:pStyle w:val="BodyText"/>
-        <w:rPr>
-          <w:b/>
-          <w:sz w:val="20"/>
-        </w:rPr>
-      </w:pPr>
-    </w:p>
-    <w:p>
-      <w:pPr>
-        <w:pStyle w:val="BodyText"/>
-        <w:rPr>
-          <w:b/>
-          <w:sz w:val="20"/>
-        </w:rPr>
-      </w:pPr>
     </w:p>
     <w:p>
       <w:pPr>
@@ -1963,7 +1931,7 @@
           </mc:Choice>
           <mc:Fallback>
             <w:pict>
-              <v:line w14:anchorId="4B82B959" id="Line 2" o:spid="_x0000_s1026" style="position:absolute;z-index:-251658240;visibility:visible;mso-wrap-style:square;mso-width-percent:0;mso-height-percent:0;mso-wrap-distance-left:0;mso-wrap-distance-top:0;mso-wrap-distance-right:0;mso-wrap-distance-bottom:0;mso-position-horizontal:absolute;mso-position-horizontal-relative:page;mso-position-vertical:absolute;mso-position-vertical-relative:text;mso-width-percent:0;mso-height-percent:0;mso-width-relative:page;mso-height-relative:page" from="72.05pt,12.65pt" to="216.2pt,12.65pt" o:gfxdata="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" strokeweight=".26481mm">
+              <v:line w14:anchorId="0A142CC6" id="Line 2" o:spid="_x0000_s1026" style="position:absolute;z-index:-251658240;visibility:visible;mso-wrap-style:square;mso-width-percent:0;mso-height-percent:0;mso-wrap-distance-left:0;mso-wrap-distance-top:0;mso-wrap-distance-right:0;mso-wrap-distance-bottom:0;mso-position-horizontal:absolute;mso-position-horizontal-relative:page;mso-position-vertical:absolute;mso-position-vertical-relative:text;mso-width-percent:0;mso-height-percent:0;mso-width-relative:page;mso-height-relative:page" from="72.05pt,12.65pt" to="216.2pt,12.65pt" o:gfxdata="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" strokeweight=".26481mm">
                 <w10:wrap type="topAndBottom" anchorx="page"/>
               </v:line>
             </w:pict>
@@ -1979,73 +1947,6 @@
           <w:sz w:val="20"/>
         </w:rPr>
       </w:pPr>
-      <w:r>
-        <w:rPr>
-          <w:position w:val="8"/>
-          <w:sz w:val="12"/>
-        </w:rPr>
-        <w:t xml:space="preserve">1 </w:t>
-      </w:r>
-      <w:r>
-        <w:rPr>
-          <w:sz w:val="20"/>
-        </w:rPr>
-        <w:t xml:space="preserve">Esto hace referencia a </w:t>
-      </w:r>
-      <w:r>
-        <w:rPr>
-          <w:color w:val="1154CC"/>
-          <w:spacing w:val="-100"/>
-          <w:sz w:val="20"/>
-          <w:u w:val="single" w:color="1154CC"/>
-        </w:rPr>
-        <w:t>h</w:t>
-      </w:r>
-      <w:hyperlink r:id="rId5">
-        <w:r>
-          <w:rPr>
-            <w:color w:val="1154CC"/>
-            <w:spacing w:val="41"/>
-            <w:sz w:val="20"/>
-          </w:rPr>
-          <w:t xml:space="preserve"> </w:t>
-        </w:r>
-        <w:r>
-          <w:rPr>
-            <w:color w:val="1154CC"/>
-            <w:sz w:val="20"/>
-            <w:u w:val="single" w:color="1154CC"/>
-          </w:rPr>
-          <w:t>ttps://drive.google.com/file/d/0Bwy19LIX4H2Ra0VKeFV1UXhGdG8/view</w:t>
-        </w:r>
-        <w:r>
-          <w:rPr>
-            <w:color w:val="1154CC"/>
-            <w:sz w:val="20"/>
-          </w:rPr>
-          <w:t xml:space="preserve"> </w:t>
-        </w:r>
-      </w:hyperlink>
-      <w:r>
-        <w:rPr>
-          <w:sz w:val="20"/>
-        </w:rPr>
-        <w:t xml:space="preserve">en la </w:t>
-      </w:r>
-      <w:proofErr w:type="spellStart"/>
-      <w:r>
-        <w:rPr>
-          <w:sz w:val="20"/>
-        </w:rPr>
-        <w:t>pagina</w:t>
-      </w:r>
-      <w:proofErr w:type="spellEnd"/>
-      <w:r>
-        <w:rPr>
-          <w:sz w:val="20"/>
-        </w:rPr>
-        <w:t xml:space="preserve"> 10</w:t>
-      </w:r>
     </w:p>
     <w:sectPr>
       <w:pgSz w:w="11920" w:h="16860"/>

</xml_diff>